<commit_message>
Light code panels, and numbering that survives a save in Word
Code blocks move from a dark panel to a light one in all four templates, with the
keyword colour following each theme's accent and inline code sharing the panel.

Heading numbering is rewritten in Word's linked-style form: a numbering style, the
list definition that declares it, and a second definition that points back at it,
with nsid and tmpl present. Written the previous way, Word dropped the numbering
from the heading styles on the first save. Section Number now carries no formatting
and every numbered heading has a tab stop, so pandoc's --number-sections works as a
fallback that cannot be stripped.

Co-Authored-By: Claude Opus 5 <noreply@anthropic.com>
Claude-Session: https://claude.ai/code/session_01T3fp19CDdFKnm2BANxdQC1
</commit_message>
<xml_diff>
--- a/templates/atlas-reference.docx
+++ b/templates/atlas-reference.docx
@@ -1954,6 +1954,9 @@
       <w:pBdr>
         <w:top w:val="single" w:sz="24" w:space="6" w:color="8C1D34"/>
       </w:pBdr>
+      <w:tabs>
+        <w:tab w:val="left" w:pos="595"/>
+      </w:tabs>
       <w:spacing w:before="560" w:after="180" w:line="240" w:lineRule="auto"/>
     </w:pPr>
     <w:rPr>
@@ -1984,6 +1987,9 @@
     <w:pPr>
       <w:keepNext/>
       <w:keepLines/>
+      <w:tabs>
+        <w:tab w:val="left" w:pos="793"/>
+      </w:tabs>
       <w:spacing w:before="420" w:after="120" w:line="240" w:lineRule="auto"/>
     </w:pPr>
     <w:rPr>
@@ -2014,6 +2020,9 @@
     <w:pPr>
       <w:keepNext/>
       <w:keepLines/>
+      <w:tabs>
+        <w:tab w:val="left" w:pos="992"/>
+      </w:tabs>
       <w:spacing w:before="320" w:after="90" w:line="240" w:lineRule="auto"/>
     </w:pPr>
     <w:rPr>
@@ -2044,6 +2053,9 @@
     <w:pPr>
       <w:keepNext/>
       <w:keepLines/>
+      <w:tabs>
+        <w:tab w:val="left" w:pos="1190"/>
+      </w:tabs>
       <w:spacing w:before="280" w:after="80" w:line="240" w:lineRule="auto"/>
     </w:pPr>
     <w:rPr>
@@ -2075,6 +2087,9 @@
     <w:pPr>
       <w:keepNext/>
       <w:keepLines/>
+      <w:tabs>
+        <w:tab w:val="left" w:pos="1389"/>
+      </w:tabs>
       <w:spacing w:before="250" w:after="70" w:line="240" w:lineRule="auto"/>
     </w:pPr>
     <w:rPr>
@@ -2307,19 +2322,20 @@
     <w:pPr>
       <w:wordWrap w:val="off"/>
       <w:keepLines/>
-      <w:shd w:val="clear" w:color="auto" w:fill="2C2C30"/>
+      <w:shd w:val="clear" w:color="auto" w:fill="F8F5F5"/>
       <w:pBdr>
-        <w:top w:val="single" w:sz="2" w:space="5" w:color="2C2C30"/>
-        <w:bottom w:val="single" w:sz="2" w:space="5" w:color="2C2C30"/>
-        <w:left w:val="single" w:sz="2" w:space="8" w:color="2C2C30"/>
-        <w:right w:val="single" w:sz="2" w:space="8" w:color="2C2C30"/>
+        <w:left w:val="single" w:sz="18" w:space="8" w:color="8C1D34"/>
+        <w:top w:val="single" w:sz="2" w:space="6" w:color="F8F5F5"/>
+        <w:bottom w:val="single" w:sz="2" w:space="6" w:color="F8F5F5"/>
+        <w:left w:val="single" w:sz="2" w:space="8" w:color="F8F5F5"/>
+        <w:right w:val="single" w:sz="2" w:space="8" w:color="F8F5F5"/>
       </w:pBdr>
       <w:spacing w:before="0" w:after="0" w:line="240" w:lineRule="auto"/>
       <w:contextualSpacing/>
     </w:pPr>
     <w:rPr>
       <w:rFonts w:ascii="Consolas" w:hAnsi="Consolas" w:cs="Consolas"/>
-      <w:color w:val="E8E6E3"/>
+      <w:color w:val="24292F"/>
       <w:sz w:val="19"/>
       <w:szCs w:val="19"/>
     </w:rPr>
@@ -2333,7 +2349,7 @@
       <w:color w:val="1B1B1D"/>
       <w:sz w:val="20"/>
       <w:szCs w:val="20"/>
-      <w:shd w:val="clear" w:color="auto" w:fill="F7EDEF"/>
+      <w:shd w:val="clear" w:color="auto" w:fill="F8F5F5"/>
     </w:rPr>
   </w:style>
   <w:style w:type="character" w:customStyle="1" w:styleId="KeywordTok">
@@ -2342,7 +2358,7 @@
     <w:rPr>
       <w:rFonts w:ascii="Consolas" w:hAnsi="Consolas" w:cs="Consolas"/>
       <w:b/>
-      <w:color w:val="7FB2FF"/>
+      <w:color w:val="5E1323"/>
       <w:sz w:val="19"/>
       <w:szCs w:val="19"/>
     </w:rPr>
@@ -2353,7 +2369,7 @@
     <w:rPr>
       <w:rFonts w:ascii="Consolas" w:hAnsi="Consolas" w:cs="Consolas"/>
       <w:b/>
-      <w:color w:val="7FB2FF"/>
+      <w:color w:val="5E1323"/>
       <w:sz w:val="19"/>
       <w:szCs w:val="19"/>
     </w:rPr>
@@ -2364,7 +2380,7 @@
     <w:rPr>
       <w:rFonts w:ascii="Consolas" w:hAnsi="Consolas" w:cs="Consolas"/>
       <w:b/>
-      <w:color w:val="7FB2FF"/>
+      <w:color w:val="5E1323"/>
       <w:sz w:val="19"/>
       <w:szCs w:val="19"/>
     </w:rPr>
@@ -2374,7 +2390,7 @@
     <w:basedOn w:val="DefaultParagraphFont"/>
     <w:rPr>
       <w:rFonts w:ascii="Consolas" w:hAnsi="Consolas" w:cs="Consolas"/>
-      <w:color w:val="7FD8C0"/>
+      <w:color w:val="0F6F6C"/>
       <w:sz w:val="19"/>
       <w:szCs w:val="19"/>
     </w:rPr>
@@ -2384,7 +2400,7 @@
     <w:basedOn w:val="DefaultParagraphFont"/>
     <w:rPr>
       <w:rFonts w:ascii="Consolas" w:hAnsi="Consolas" w:cs="Consolas"/>
-      <w:color w:val="FFB86B"/>
+      <w:color w:val="8C2D18"/>
       <w:sz w:val="19"/>
       <w:szCs w:val="19"/>
     </w:rPr>
@@ -2394,7 +2410,7 @@
     <w:basedOn w:val="DefaultParagraphFont"/>
     <w:rPr>
       <w:rFonts w:ascii="Consolas" w:hAnsi="Consolas" w:cs="Consolas"/>
-      <w:color w:val="FFB86B"/>
+      <w:color w:val="8C2D18"/>
       <w:sz w:val="19"/>
       <w:szCs w:val="19"/>
     </w:rPr>
@@ -2404,7 +2420,7 @@
     <w:basedOn w:val="DefaultParagraphFont"/>
     <w:rPr>
       <w:rFonts w:ascii="Consolas" w:hAnsi="Consolas" w:cs="Consolas"/>
-      <w:color w:val="FFB86B"/>
+      <w:color w:val="8C2D18"/>
       <w:sz w:val="19"/>
       <w:szCs w:val="19"/>
     </w:rPr>
@@ -2414,7 +2430,7 @@
     <w:basedOn w:val="DefaultParagraphFont"/>
     <w:rPr>
       <w:rFonts w:ascii="Consolas" w:hAnsi="Consolas" w:cs="Consolas"/>
-      <w:color w:val="FFB86B"/>
+      <w:color w:val="8C2D18"/>
       <w:sz w:val="19"/>
       <w:szCs w:val="19"/>
     </w:rPr>
@@ -2424,7 +2440,7 @@
     <w:basedOn w:val="DefaultParagraphFont"/>
     <w:rPr>
       <w:rFonts w:ascii="Consolas" w:hAnsi="Consolas" w:cs="Consolas"/>
-      <w:color w:val="FFB86B"/>
+      <w:color w:val="8C2D18"/>
       <w:sz w:val="19"/>
       <w:szCs w:val="19"/>
     </w:rPr>
@@ -2434,7 +2450,7 @@
     <w:basedOn w:val="DefaultParagraphFont"/>
     <w:rPr>
       <w:rFonts w:ascii="Consolas" w:hAnsi="Consolas" w:cs="Consolas"/>
-      <w:color w:val="FFB86B"/>
+      <w:color w:val="8C2D18"/>
       <w:sz w:val="19"/>
       <w:szCs w:val="19"/>
     </w:rPr>
@@ -2444,7 +2460,7 @@
     <w:basedOn w:val="DefaultParagraphFont"/>
     <w:rPr>
       <w:rFonts w:ascii="Consolas" w:hAnsi="Consolas" w:cs="Consolas"/>
-      <w:color w:val="FFB86B"/>
+      <w:color w:val="8C2D18"/>
       <w:sz w:val="19"/>
       <w:szCs w:val="19"/>
     </w:rPr>
@@ -2454,7 +2470,7 @@
     <w:basedOn w:val="DefaultParagraphFont"/>
     <w:rPr>
       <w:rFonts w:ascii="Consolas" w:hAnsi="Consolas" w:cs="Consolas"/>
-      <w:color w:val="FFB86B"/>
+      <w:color w:val="8C2D18"/>
       <w:sz w:val="19"/>
       <w:szCs w:val="19"/>
     </w:rPr>
@@ -2464,7 +2480,7 @@
     <w:basedOn w:val="DefaultParagraphFont"/>
     <w:rPr>
       <w:rFonts w:ascii="Consolas" w:hAnsi="Consolas" w:cs="Consolas"/>
-      <w:color w:val="9EDE9B"/>
+      <w:color w:val="1D6F42"/>
       <w:sz w:val="19"/>
       <w:szCs w:val="19"/>
     </w:rPr>
@@ -2474,7 +2490,7 @@
     <w:basedOn w:val="DefaultParagraphFont"/>
     <w:rPr>
       <w:rFonts w:ascii="Consolas" w:hAnsi="Consolas" w:cs="Consolas"/>
-      <w:color w:val="9EDE9B"/>
+      <w:color w:val="1D6F42"/>
       <w:sz w:val="19"/>
       <w:szCs w:val="19"/>
     </w:rPr>
@@ -2484,7 +2500,7 @@
     <w:basedOn w:val="DefaultParagraphFont"/>
     <w:rPr>
       <w:rFonts w:ascii="Consolas" w:hAnsi="Consolas" w:cs="Consolas"/>
-      <w:color w:val="9EDE9B"/>
+      <w:color w:val="1D6F42"/>
       <w:sz w:val="19"/>
       <w:szCs w:val="19"/>
     </w:rPr>
@@ -2494,7 +2510,7 @@
     <w:basedOn w:val="DefaultParagraphFont"/>
     <w:rPr>
       <w:rFonts w:ascii="Consolas" w:hAnsi="Consolas" w:cs="Consolas"/>
-      <w:color w:val="9EDE9B"/>
+      <w:color w:val="1D6F42"/>
       <w:sz w:val="19"/>
       <w:szCs w:val="19"/>
     </w:rPr>
@@ -2505,7 +2521,7 @@
     <w:rPr>
       <w:rFonts w:ascii="Consolas" w:hAnsi="Consolas" w:cs="Consolas"/>
       <w:i/>
-      <w:color w:val="7D8794"/>
+      <w:color w:val="8A8F98"/>
       <w:sz w:val="19"/>
       <w:szCs w:val="19"/>
     </w:rPr>
@@ -2516,7 +2532,7 @@
     <w:rPr>
       <w:rFonts w:ascii="Consolas" w:hAnsi="Consolas" w:cs="Consolas"/>
       <w:i/>
-      <w:color w:val="7D8794"/>
+      <w:color w:val="8A8F98"/>
       <w:sz w:val="19"/>
       <w:szCs w:val="19"/>
     </w:rPr>
@@ -2527,7 +2543,7 @@
     <w:rPr>
       <w:rFonts w:ascii="Consolas" w:hAnsi="Consolas" w:cs="Consolas"/>
       <w:i/>
-      <w:color w:val="7D8794"/>
+      <w:color w:val="8A8F98"/>
       <w:sz w:val="19"/>
       <w:szCs w:val="19"/>
     </w:rPr>
@@ -2538,7 +2554,7 @@
     <w:rPr>
       <w:rFonts w:ascii="Consolas" w:hAnsi="Consolas" w:cs="Consolas"/>
       <w:i/>
-      <w:color w:val="7D8794"/>
+      <w:color w:val="8A8F98"/>
       <w:sz w:val="19"/>
       <w:szCs w:val="19"/>
     </w:rPr>
@@ -2549,7 +2565,7 @@
     <w:rPr>
       <w:rFonts w:ascii="Consolas" w:hAnsi="Consolas" w:cs="Consolas"/>
       <w:i/>
-      <w:color w:val="7D8794"/>
+      <w:color w:val="8A8F98"/>
       <w:sz w:val="19"/>
       <w:szCs w:val="19"/>
     </w:rPr>
@@ -2560,7 +2576,7 @@
     <w:rPr>
       <w:rFonts w:ascii="Consolas" w:hAnsi="Consolas" w:cs="Consolas"/>
       <w:i/>
-      <w:color w:val="7D8794"/>
+      <w:color w:val="8A8F98"/>
       <w:sz w:val="19"/>
       <w:szCs w:val="19"/>
     </w:rPr>
@@ -2570,7 +2586,7 @@
     <w:basedOn w:val="DefaultParagraphFont"/>
     <w:rPr>
       <w:rFonts w:ascii="Consolas" w:hAnsi="Consolas" w:cs="Consolas"/>
-      <w:color w:val="E0A3FF"/>
+      <w:color w:val="6A3D9A"/>
       <w:sz w:val="19"/>
       <w:szCs w:val="19"/>
     </w:rPr>
@@ -2580,7 +2596,7 @@
     <w:basedOn w:val="DefaultParagraphFont"/>
     <w:rPr>
       <w:rFonts w:ascii="Consolas" w:hAnsi="Consolas" w:cs="Consolas"/>
-      <w:color w:val="E0A3FF"/>
+      <w:color w:val="6A3D9A"/>
       <w:sz w:val="19"/>
       <w:szCs w:val="19"/>
     </w:rPr>
@@ -2590,7 +2606,7 @@
     <w:basedOn w:val="DefaultParagraphFont"/>
     <w:rPr>
       <w:rFonts w:ascii="Consolas" w:hAnsi="Consolas" w:cs="Consolas"/>
-      <w:color w:val="E0A3FF"/>
+      <w:color w:val="6A3D9A"/>
       <w:sz w:val="19"/>
       <w:szCs w:val="19"/>
     </w:rPr>
@@ -2600,7 +2616,7 @@
     <w:basedOn w:val="DefaultParagraphFont"/>
     <w:rPr>
       <w:rFonts w:ascii="Consolas" w:hAnsi="Consolas" w:cs="Consolas"/>
-      <w:color w:val="D6DBE3"/>
+      <w:color w:val="24292F"/>
       <w:sz w:val="19"/>
       <w:szCs w:val="19"/>
     </w:rPr>
@@ -2610,7 +2626,7 @@
     <w:basedOn w:val="DefaultParagraphFont"/>
     <w:rPr>
       <w:rFonts w:ascii="Consolas" w:hAnsi="Consolas" w:cs="Consolas"/>
-      <w:color w:val="D6DBE3"/>
+      <w:color w:val="24292F"/>
       <w:sz w:val="19"/>
       <w:szCs w:val="19"/>
     </w:rPr>
@@ -2620,7 +2636,7 @@
     <w:basedOn w:val="DefaultParagraphFont"/>
     <w:rPr>
       <w:rFonts w:ascii="Consolas" w:hAnsi="Consolas" w:cs="Consolas"/>
-      <w:color w:val="D6DBE3"/>
+      <w:color w:val="24292F"/>
       <w:sz w:val="19"/>
       <w:szCs w:val="19"/>
     </w:rPr>
@@ -2630,7 +2646,7 @@
     <w:basedOn w:val="DefaultParagraphFont"/>
     <w:rPr>
       <w:rFonts w:ascii="Consolas" w:hAnsi="Consolas" w:cs="Consolas"/>
-      <w:color w:val="D6DBE3"/>
+      <w:color w:val="24292F"/>
       <w:sz w:val="19"/>
       <w:szCs w:val="19"/>
     </w:rPr>
@@ -2641,7 +2657,7 @@
     <w:rPr>
       <w:rFonts w:ascii="Consolas" w:hAnsi="Consolas" w:cs="Consolas"/>
       <w:b/>
-      <w:color w:val="FF8A6B"/>
+      <w:color w:val="B3261E"/>
       <w:sz w:val="19"/>
       <w:szCs w:val="19"/>
     </w:rPr>
@@ -2652,7 +2668,7 @@
     <w:rPr>
       <w:rFonts w:ascii="Consolas" w:hAnsi="Consolas" w:cs="Consolas"/>
       <w:b/>
-      <w:color w:val="FF8A6B"/>
+      <w:color w:val="B3261E"/>
       <w:sz w:val="19"/>
       <w:szCs w:val="19"/>
     </w:rPr>
@@ -2696,10 +2712,6 @@
   <w:style w:type="character" w:styleId="SectionNumber">
     <w:name w:val="Section Number"/>
     <w:basedOn w:val="DefaultParagraphFont"/>
-    <w:rPr>
-      <w:rFonts w:ascii="Aptos" w:hAnsi="Aptos" w:cs="Aptos"/>
-      <w:color w:val="6A6A70"/>
-    </w:rPr>
   </w:style>
   <w:style w:type="paragraph" w:styleId="Bibliography">
     <w:name w:val="Bibliography"/>

</xml_diff>